<commit_message>
chore: update quote template docx files
Co-Authored-By: Claude Sonnet 4.6 <noreply@anthropic.com>
</commit_message>
<xml_diff>
--- a/templates/Quote_format_Extended_Warranty_High_Vtg.docx
+++ b/templates/Quote_format_Extended_Warranty_High_Vtg.docx
@@ -108,7 +108,17 @@
           <w:sz w:val="22"/>
           <w:szCs w:val="22"/>
         </w:rPr>
-        <w:t>EVTPL/25-26/</w:t>
+        <w:t>EVTPL/26-27</w:t>
+      </w:r>
+      <w:bookmarkStart w:id="0" w:name="_GoBack"/>
+      <w:bookmarkEnd w:id="0"/>
+      <w:r>
+        <w:rPr>
+          <w:rFonts w:ascii="Calibri" w:hAnsi="Calibri"/>
+          <w:sz w:val="22"/>
+          <w:szCs w:val="22"/>
+        </w:rPr>
+        <w:t>/</w:t>
       </w:r>
       <w:r>
         <w:rPr>
@@ -299,8 +309,6 @@
         </w:rPr>
         <w:t>{{CUSTOMER_NAME}}</w:t>
       </w:r>
-      <w:bookmarkStart w:id="0" w:name="_GoBack"/>
-      <w:bookmarkEnd w:id="0"/>
     </w:p>
     <w:p>
       <w:pPr>
@@ -383,7 +391,25 @@
           <w:sz w:val="22"/>
           <w:szCs w:val="22"/>
         </w:rPr>
-        <w:t>Greetings from Enertect Visio</w:t>
+        <w:t xml:space="preserve">Greetings from </w:t>
+      </w:r>
+      <w:proofErr w:type="spellStart"/>
+      <w:r>
+        <w:rPr>
+          <w:rFonts w:ascii="Calibri" w:hAnsi="Calibri"/>
+          <w:sz w:val="22"/>
+          <w:szCs w:val="22"/>
+        </w:rPr>
+        <w:t>Enertect</w:t>
+      </w:r>
+      <w:proofErr w:type="spellEnd"/>
+      <w:r>
+        <w:rPr>
+          <w:rFonts w:ascii="Calibri" w:hAnsi="Calibri"/>
+          <w:sz w:val="22"/>
+          <w:szCs w:val="22"/>
+        </w:rPr>
+        <w:t xml:space="preserve"> Visio</w:t>
       </w:r>
       <w:r>
         <w:rPr>
@@ -696,6 +722,7 @@
           <w:lang w:val="en-IN" w:eastAsia="en-IN"/>
         </w:rPr>
       </w:pPr>
+      <w:proofErr w:type="spellStart"/>
       <w:r>
         <w:rPr>
           <w:rFonts w:ascii="Calibri" w:hAnsi="Calibri"/>
@@ -703,8 +730,29 @@
           <w:szCs w:val="22"/>
           <w:lang w:val="en-IN" w:eastAsia="en-IN"/>
         </w:rPr>
-        <w:t>Swapnali Ajgaonkar</w:t>
-      </w:r>
+        <w:t>Swapnali</w:t>
+      </w:r>
+      <w:proofErr w:type="spellEnd"/>
+      <w:r>
+        <w:rPr>
+          <w:rFonts w:ascii="Calibri" w:hAnsi="Calibri"/>
+          <w:sz w:val="22"/>
+          <w:szCs w:val="22"/>
+          <w:lang w:val="en-IN" w:eastAsia="en-IN"/>
+        </w:rPr>
+        <w:t xml:space="preserve"> </w:t>
+      </w:r>
+      <w:proofErr w:type="spellStart"/>
+      <w:r>
+        <w:rPr>
+          <w:rFonts w:ascii="Calibri" w:hAnsi="Calibri"/>
+          <w:sz w:val="22"/>
+          <w:szCs w:val="22"/>
+          <w:lang w:val="en-IN" w:eastAsia="en-IN"/>
+        </w:rPr>
+        <w:t>Ajgaonkar</w:t>
+      </w:r>
+      <w:proofErr w:type="spellEnd"/>
       <w:r>
         <w:rPr>
           <w:rFonts w:ascii="Calibri" w:hAnsi="Calibri"/>
@@ -1322,7 +1370,29 @@
           <w:sz w:val="22"/>
           <w:szCs w:val="22"/>
         </w:rPr>
-        <w:t xml:space="preserve"> For the Detail terms and conditions.</w:t>
+        <w:t xml:space="preserve"> </w:t>
+      </w:r>
+      <w:proofErr w:type="gramStart"/>
+      <w:r>
+        <w:rPr>
+          <w:rFonts w:ascii="Calibri" w:hAnsi="Calibri"/>
+          <w:b/>
+          <w:bCs/>
+          <w:sz w:val="22"/>
+          <w:szCs w:val="22"/>
+        </w:rPr>
+        <w:t>For</w:t>
+      </w:r>
+      <w:proofErr w:type="gramEnd"/>
+      <w:r>
+        <w:rPr>
+          <w:rFonts w:ascii="Calibri" w:hAnsi="Calibri"/>
+          <w:b/>
+          <w:bCs/>
+          <w:sz w:val="22"/>
+          <w:szCs w:val="22"/>
+        </w:rPr>
+        <w:t xml:space="preserve"> the Detail terms and conditions.</w:t>
       </w:r>
     </w:p>
     <w:p>
@@ -1646,6 +1716,7 @@
                 <w:shd w:val="clear" w:color="auto" w:fill="FFFFFF"/>
               </w:rPr>
             </w:pPr>
+            <w:proofErr w:type="gramStart"/>
             <w:r>
               <w:rPr>
                 <w:rFonts w:ascii="Calibri" w:hAnsi="Calibri" w:cs="Calibri"/>
@@ -1653,7 +1724,17 @@
                 <w:szCs w:val="22"/>
                 <w:lang w:val="en-IN"/>
               </w:rPr>
-              <w:t>transported by organized transporter/ courier. Please ensure</w:t>
+              <w:t>transported</w:t>
+            </w:r>
+            <w:proofErr w:type="gramEnd"/>
+            <w:r>
+              <w:rPr>
+                <w:rFonts w:ascii="Calibri" w:hAnsi="Calibri" w:cs="Calibri"/>
+                <w:sz w:val="22"/>
+                <w:szCs w:val="22"/>
+                <w:lang w:val="en-IN"/>
+              </w:rPr>
+              <w:t xml:space="preserve"> by organized transporter/ courier. Please ensure</w:t>
             </w:r>
           </w:p>
         </w:tc>
@@ -1831,14 +1912,14 @@
                 <w:sz w:val="22"/>
                 <w:szCs w:val="22"/>
               </w:rPr>
-              <w:t>Price is based on USD 1: INR 8</w:t>
+              <w:t xml:space="preserve">Price is based on USD 1: INR </w:t>
             </w:r>
             <w:r>
               <w:rPr>
                 <w:sz w:val="22"/>
                 <w:szCs w:val="22"/>
               </w:rPr>
-              <w:t>7</w:t>
+              <w:t>{DOLLAR_RATE}</w:t>
             </w:r>
             <w:r>
               <w:rPr>
@@ -2189,7 +2270,39 @@
                 <w:sz w:val="22"/>
                 <w:szCs w:val="22"/>
               </w:rPr>
-              <w:t>able @ Rs 5000 per day + Travelling cost at actuals.</w:t>
+              <w:t xml:space="preserve">able @ </w:t>
+            </w:r>
+            <w:proofErr w:type="spellStart"/>
+            <w:r>
+              <w:rPr>
+                <w:sz w:val="22"/>
+                <w:szCs w:val="22"/>
+              </w:rPr>
+              <w:t>Rs</w:t>
+            </w:r>
+            <w:proofErr w:type="spellEnd"/>
+            <w:r>
+              <w:rPr>
+                <w:sz w:val="22"/>
+                <w:szCs w:val="22"/>
+              </w:rPr>
+              <w:t xml:space="preserve"> 5000 per day + </w:t>
+            </w:r>
+            <w:proofErr w:type="gramStart"/>
+            <w:r>
+              <w:rPr>
+                <w:sz w:val="22"/>
+                <w:szCs w:val="22"/>
+              </w:rPr>
+              <w:t>Travelling</w:t>
+            </w:r>
+            <w:proofErr w:type="gramEnd"/>
+            <w:r>
+              <w:rPr>
+                <w:sz w:val="22"/>
+                <w:szCs w:val="22"/>
+              </w:rPr>
+              <w:t xml:space="preserve"> cost at actuals.</w:t>
             </w:r>
           </w:p>
         </w:tc>
@@ -2695,7 +2808,7 @@
                 <w:szCs w:val="22"/>
                 <w:shd w:val="clear" w:color="auto" w:fill="FFFFFF"/>
               </w:rPr>
-              <w:t xml:space="preserve"> Extended Performance warranty 5</w:t>
+              <w:t xml:space="preserve"> Extended Performance warranty {EXTENDED_WARRANTY}</w:t>
             </w:r>
             <w:r>
               <w:rPr>
@@ -3053,7 +3166,16 @@
           <w:sz w:val="22"/>
           <w:szCs w:val="22"/>
         </w:rPr>
-        <w:t>tional performance Warranty of 5</w:t>
+        <w:t xml:space="preserve">tional performance Warranty of </w:t>
+      </w:r>
+      <w:r>
+        <w:rPr>
+          <w:rFonts w:ascii="Calibri" w:hAnsi="Calibri"/>
+          <w:sz w:val="22"/>
+          <w:szCs w:val="22"/>
+          <w:shd w:val="clear" w:color="auto" w:fill="FFFFFF"/>
+        </w:rPr>
+        <w:t>{EXTENDED_WARRANTY}</w:t>
       </w:r>
       <w:r>
         <w:rPr>
@@ -4045,7 +4167,27 @@
         <w:sz w:val="18"/>
         <w:szCs w:val="18"/>
       </w:rPr>
-      <w:t>M:. +91 9867320865</w:t>
+      <w:t>M</w:t>
+    </w:r>
+    <w:proofErr w:type="gramStart"/>
+    <w:r>
+      <w:rPr>
+        <w:rFonts w:ascii="Arial" w:hAnsi="Arial" w:cs="Arial"/>
+        <w:b/>
+        <w:sz w:val="18"/>
+        <w:szCs w:val="18"/>
+      </w:rPr>
+      <w:t>:.</w:t>
+    </w:r>
+    <w:proofErr w:type="gramEnd"/>
+    <w:r>
+      <w:rPr>
+        <w:rFonts w:ascii="Arial" w:hAnsi="Arial" w:cs="Arial"/>
+        <w:b/>
+        <w:sz w:val="18"/>
+        <w:szCs w:val="18"/>
+      </w:rPr>
+      <w:t xml:space="preserve"> +91 9867320865</w:t>
     </w:r>
     <w:r>
       <w:rPr>
@@ -4068,7 +4210,7 @@
         <w:rFonts w:ascii="Cambria" w:hAnsi="Cambria"/>
         <w:noProof/>
       </w:rPr>
-      <w:t>1</w:t>
+      <w:t>2</w:t>
     </w:r>
     <w:r>
       <w:rPr>
@@ -4234,6 +4376,7 @@
               </v:shape>
             </w:pict>
           </w:r>
+          <w:proofErr w:type="spellStart"/>
           <w:r>
             <w:rPr>
               <w:rFonts w:ascii="Cambria" w:hAnsi="Cambria"/>
@@ -4242,7 +4385,18 @@
               <w:u w:val="single"/>
               <w:lang w:val="en-IN"/>
             </w:rPr>
-            <w:t>Enertect Vision Technologies Private Limited</w:t>
+            <w:t>Enertect</w:t>
+          </w:r>
+          <w:proofErr w:type="spellEnd"/>
+          <w:r>
+            <w:rPr>
+              <w:rFonts w:ascii="Cambria" w:hAnsi="Cambria"/>
+              <w:sz w:val="36"/>
+              <w:szCs w:val="36"/>
+              <w:u w:val="single"/>
+              <w:lang w:val="en-IN"/>
+            </w:rPr>
+            <w:t xml:space="preserve"> Vision Technologies Private Limited</w:t>
           </w:r>
         </w:p>
         <w:p>
@@ -4283,7 +4437,71 @@
               <w:rFonts w:ascii="Cambria" w:hAnsi="Cambria" w:cs="Calibri"/>
               <w:color w:val="201F1E"/>
             </w:rPr>
-            <w:t>Floor, A-Wing, Udyog Bhavan 2, Plot K-3, Additional Ambernath MIDC, Ambernath(E) 421506</w:t>
+            <w:t xml:space="preserve">Floor, A-Wing, </w:t>
+          </w:r>
+          <w:proofErr w:type="spellStart"/>
+          <w:r>
+            <w:rPr>
+              <w:rFonts w:ascii="Cambria" w:hAnsi="Cambria" w:cs="Calibri"/>
+              <w:color w:val="201F1E"/>
+            </w:rPr>
+            <w:t>Udyog</w:t>
+          </w:r>
+          <w:proofErr w:type="spellEnd"/>
+          <w:r>
+            <w:rPr>
+              <w:rFonts w:ascii="Cambria" w:hAnsi="Cambria" w:cs="Calibri"/>
+              <w:color w:val="201F1E"/>
+            </w:rPr>
+            <w:t xml:space="preserve"> </w:t>
+          </w:r>
+          <w:proofErr w:type="spellStart"/>
+          <w:r>
+            <w:rPr>
+              <w:rFonts w:ascii="Cambria" w:hAnsi="Cambria" w:cs="Calibri"/>
+              <w:color w:val="201F1E"/>
+            </w:rPr>
+            <w:t>Bhavan</w:t>
+          </w:r>
+          <w:proofErr w:type="spellEnd"/>
+          <w:r>
+            <w:rPr>
+              <w:rFonts w:ascii="Cambria" w:hAnsi="Cambria" w:cs="Calibri"/>
+              <w:color w:val="201F1E"/>
+            </w:rPr>
+            <w:t xml:space="preserve"> 2, Plot K-3, Additional </w:t>
+          </w:r>
+          <w:proofErr w:type="spellStart"/>
+          <w:r>
+            <w:rPr>
+              <w:rFonts w:ascii="Cambria" w:hAnsi="Cambria" w:cs="Calibri"/>
+              <w:color w:val="201F1E"/>
+            </w:rPr>
+            <w:t>Ambernath</w:t>
+          </w:r>
+          <w:proofErr w:type="spellEnd"/>
+          <w:r>
+            <w:rPr>
+              <w:rFonts w:ascii="Cambria" w:hAnsi="Cambria" w:cs="Calibri"/>
+              <w:color w:val="201F1E"/>
+            </w:rPr>
+            <w:t xml:space="preserve"> MIDC, </w:t>
+          </w:r>
+          <w:proofErr w:type="spellStart"/>
+          <w:r>
+            <w:rPr>
+              <w:rFonts w:ascii="Cambria" w:hAnsi="Cambria" w:cs="Calibri"/>
+              <w:color w:val="201F1E"/>
+            </w:rPr>
+            <w:t>Ambernath</w:t>
+          </w:r>
+          <w:proofErr w:type="spellEnd"/>
+          <w:r>
+            <w:rPr>
+              <w:rFonts w:ascii="Cambria" w:hAnsi="Cambria" w:cs="Calibri"/>
+              <w:color w:val="201F1E"/>
+            </w:rPr>
+            <w:t>(E) 421506</w:t>
           </w:r>
         </w:p>
         <w:p>
@@ -4465,7 +4683,7 @@
         <v:path o:extrusionok="f" gradientshapeok="t" o:connecttype="rect"/>
         <o:lock v:ext="edit" aspectratio="t"/>
       </v:shapetype>
-      <v:shape id="_x0000_i1027" type="#_x0000_t75" style="width:67.5pt;height:67.5pt;visibility:visible;mso-wrap-style:square" o:bullet="t">
+      <v:shape id="_x0000_i1030" type="#_x0000_t75" style="width:67.5pt;height:67.5pt;visibility:visible;mso-wrap-style:square" o:bullet="t">
         <v:imagedata r:id="rId1" o:title=""/>
       </v:shape>
     </w:pict>
@@ -9795,6 +10013,21 @@
 </file>
 
 <file path=customXml/item1.xml><?xml version="1.0" encoding="utf-8"?>
+<p:properties xmlns:p="http://schemas.microsoft.com/office/2006/metadata/properties" xmlns:xsi="http://www.w3.org/2001/XMLSchema-instance">
+  <documentManagement/>
+</p:properties>
+</file>
+
+<file path=customXml/item2.xml><?xml version="1.0" encoding="utf-8"?>
+<?mso-contentType ?>
+<FormTemplates xmlns="http://schemas.microsoft.com/sharepoint/v3/contenttype/forms">
+  <Display>DocumentLibraryForm</Display>
+  <Edit>DocumentLibraryForm</Edit>
+  <New>DocumentLibraryForm</New>
+</FormTemplates>
+</file>
+
+<file path=customXml/item3.xml><?xml version="1.0" encoding="utf-8"?>
 <ct:contentTypeSchema xmlns:ct="http://schemas.microsoft.com/office/2006/metadata/contentType" xmlns:ma="http://schemas.microsoft.com/office/2006/metadata/properties/metaAttributes" ct:_="" ma:_="" ma:contentTypeName="Document" ma:contentTypeID="0x0101001D15C10228FC8947975F9870E6709E10" ma:contentTypeVersion="12" ma:contentTypeDescription="Create a new document." ma:contentTypeScope="" ma:versionID="9f397cbd210293a217e65f2acf7abe3c">
   <xsd:schema xmlns:xsd="http://www.w3.org/2001/XMLSchema" xmlns:xs="http://www.w3.org/2001/XMLSchema" xmlns:p="http://schemas.microsoft.com/office/2006/metadata/properties" xmlns:ns2="fb2b781a-e873-448f-bf30-e67dc0d4142b" xmlns:ns3="e9cfa731-cee6-488d-b7b2-fa88c28d8296" targetNamespace="http://schemas.microsoft.com/office/2006/metadata/properties" ma:root="true" ma:fieldsID="1a1f3ea794ea226d04218e70e7a461f0" ns2:_="" ns3:_="">
     <xsd:import namespace="fb2b781a-e873-448f-bf30-e67dc0d4142b"/>
@@ -10011,26 +10244,27 @@
 </ct:contentTypeSchema>
 </file>
 
-<file path=customXml/item2.xml><?xml version="1.0" encoding="utf-8"?>
-<?mso-contentType ?>
-<FormTemplates xmlns="http://schemas.microsoft.com/sharepoint/v3/contenttype/forms">
-  <Display>DocumentLibraryForm</Display>
-  <Edit>DocumentLibraryForm</Edit>
-  <New>DocumentLibraryForm</New>
-</FormTemplates>
-</file>
-
-<file path=customXml/item3.xml><?xml version="1.0" encoding="utf-8"?>
-<p:properties xmlns:p="http://schemas.microsoft.com/office/2006/metadata/properties" xmlns:xsi="http://www.w3.org/2001/XMLSchema-instance">
-  <documentManagement/>
-</p:properties>
-</file>
-
 <file path=customXml/item4.xml><?xml version="1.0" encoding="utf-8"?>
 <b:Sources xmlns:b="http://schemas.openxmlformats.org/officeDocument/2006/bibliography" xmlns="http://schemas.openxmlformats.org/officeDocument/2006/bibliography" SelectedStyle="\APASixthEditionOfficeOnline.xsl" StyleName="APA" Version="6"/>
 </file>
 
 <file path=customXml/itemProps1.xml><?xml version="1.0" encoding="utf-8"?>
+<ds:datastoreItem xmlns:ds="http://schemas.openxmlformats.org/officeDocument/2006/customXml" ds:itemID="{31D07414-A07F-448A-AB9E-51197541B7C3}">
+  <ds:schemaRefs>
+    <ds:schemaRef ds:uri="http://schemas.microsoft.com/office/2006/metadata/properties"/>
+  </ds:schemaRefs>
+</ds:datastoreItem>
+</file>
+
+<file path=customXml/itemProps2.xml><?xml version="1.0" encoding="utf-8"?>
+<ds:datastoreItem xmlns:ds="http://schemas.openxmlformats.org/officeDocument/2006/customXml" ds:itemID="{186B723D-8A10-489B-9B26-107F827BD561}">
+  <ds:schemaRefs>
+    <ds:schemaRef ds:uri="http://schemas.microsoft.com/sharepoint/v3/contenttype/forms"/>
+  </ds:schemaRefs>
+</ds:datastoreItem>
+</file>
+
+<file path=customXml/itemProps3.xml><?xml version="1.0" encoding="utf-8"?>
 <ds:datastoreItem xmlns:ds="http://schemas.openxmlformats.org/officeDocument/2006/customXml" ds:itemID="{72498EE8-E5A0-451D-B205-7BCBA2230FDD}">
   <ds:schemaRefs>
     <ds:schemaRef ds:uri="http://schemas.microsoft.com/office/2006/metadata/contentType"/>
@@ -10049,24 +10283,8 @@
 </ds:datastoreItem>
 </file>
 
-<file path=customXml/itemProps2.xml><?xml version="1.0" encoding="utf-8"?>
-<ds:datastoreItem xmlns:ds="http://schemas.openxmlformats.org/officeDocument/2006/customXml" ds:itemID="{186B723D-8A10-489B-9B26-107F827BD561}">
-  <ds:schemaRefs>
-    <ds:schemaRef ds:uri="http://schemas.microsoft.com/sharepoint/v3/contenttype/forms"/>
-  </ds:schemaRefs>
-</ds:datastoreItem>
-</file>
-
-<file path=customXml/itemProps3.xml><?xml version="1.0" encoding="utf-8"?>
-<ds:datastoreItem xmlns:ds="http://schemas.openxmlformats.org/officeDocument/2006/customXml" ds:itemID="{31D07414-A07F-448A-AB9E-51197541B7C3}">
-  <ds:schemaRefs>
-    <ds:schemaRef ds:uri="http://schemas.microsoft.com/office/2006/metadata/properties"/>
-  </ds:schemaRefs>
-</ds:datastoreItem>
-</file>
-
 <file path=customXml/itemProps4.xml><?xml version="1.0" encoding="utf-8"?>
-<ds:datastoreItem xmlns:ds="http://schemas.openxmlformats.org/officeDocument/2006/customXml" ds:itemID="{91FFB4B3-6384-4170-8F3F-F6D6898276E4}">
+<ds:datastoreItem xmlns:ds="http://schemas.openxmlformats.org/officeDocument/2006/customXml" ds:itemID="{1AF46C8B-706E-4D75-9081-83EB673E4579}">
   <ds:schemaRefs>
     <ds:schemaRef ds:uri="http://schemas.openxmlformats.org/officeDocument/2006/bibliography"/>
   </ds:schemaRefs>

</xml_diff>